<commit_message>
feat: level comunication between scenes
</commit_message>
<xml_diff>
--- a/docu/Notas tfg.docx
+++ b/docu/Notas tfg.docx
@@ -9,6 +9,7 @@
           <w:rFonts w:ascii="Aptos Display" w:eastAsia="Aptos Display" w:hAnsi="Aptos Display" w:cs="Aptos Display"/>
           <w:spacing w:val="-10"/>
           <w:sz w:val="56"/>
+          <w:lang w:val="en-US"/>
         </w:rPr>
       </w:pPr>
       <w:r>
@@ -16,60 +17,38 @@
           <w:rFonts w:ascii="Aptos Display" w:eastAsia="Aptos Display" w:hAnsi="Aptos Display" w:cs="Aptos Display"/>
           <w:spacing w:val="-10"/>
           <w:sz w:val="56"/>
-        </w:rPr>
-        <w:t xml:space="preserve">Notas </w:t>
-      </w:r>
-      <w:proofErr w:type="spellStart"/>
-      <w:r>
-        <w:rPr>
-          <w:rFonts w:ascii="Aptos Display" w:eastAsia="Aptos Display" w:hAnsi="Aptos Display" w:cs="Aptos Display"/>
-          <w:spacing w:val="-10"/>
-          <w:sz w:val="56"/>
-        </w:rPr>
-        <w:t>tfg</w:t>
-      </w:r>
-      <w:proofErr w:type="spellEnd"/>
-    </w:p>
-    <w:p>
-      <w:pPr>
-        <w:spacing w:line="259" w:lineRule="auto"/>
-        <w:rPr>
-          <w:rFonts w:ascii="Aptos" w:eastAsia="Aptos" w:hAnsi="Aptos" w:cs="Aptos"/>
-          <w:sz w:val="22"/>
-        </w:rPr>
-      </w:pPr>
-    </w:p>
-    <w:p>
-      <w:pPr>
-        <w:spacing w:line="259" w:lineRule="auto"/>
-        <w:ind w:left="708" w:hanging="708"/>
-        <w:rPr>
-          <w:rFonts w:ascii="Aptos" w:eastAsia="Aptos" w:hAnsi="Aptos" w:cs="Aptos"/>
-          <w:sz w:val="22"/>
-        </w:rPr>
-      </w:pPr>
-      <w:r>
-        <w:rPr>
-          <w:rFonts w:ascii="Aptos" w:eastAsia="Aptos" w:hAnsi="Aptos" w:cs="Aptos"/>
-          <w:sz w:val="22"/>
-        </w:rPr>
-        <w:t xml:space="preserve">Versión </w:t>
-      </w:r>
-      <w:proofErr w:type="spellStart"/>
-      <w:r>
-        <w:rPr>
-          <w:rFonts w:ascii="Aptos" w:eastAsia="Aptos" w:hAnsi="Aptos" w:cs="Aptos"/>
-          <w:sz w:val="22"/>
-        </w:rPr>
-        <w:t>unity</w:t>
-      </w:r>
-      <w:proofErr w:type="spellEnd"/>
-      <w:r>
-        <w:rPr>
-          <w:rFonts w:ascii="Aptos" w:eastAsia="Aptos" w:hAnsi="Aptos" w:cs="Aptos"/>
-          <w:sz w:val="22"/>
-        </w:rPr>
-        <w:t>: 2022.3.25f1</w:t>
+          <w:lang w:val="en-US"/>
+        </w:rPr>
+        <w:t>Notas tfg</w:t>
+      </w:r>
+    </w:p>
+    <w:p>
+      <w:pPr>
+        <w:spacing w:line="259" w:lineRule="auto"/>
+        <w:rPr>
+          <w:rFonts w:ascii="Aptos" w:eastAsia="Aptos" w:hAnsi="Aptos" w:cs="Aptos"/>
+          <w:sz w:val="22"/>
+          <w:lang w:val="en-US"/>
+        </w:rPr>
+      </w:pPr>
+    </w:p>
+    <w:p>
+      <w:pPr>
+        <w:spacing w:line="259" w:lineRule="auto"/>
+        <w:ind w:left="708" w:hanging="708"/>
+        <w:rPr>
+          <w:rFonts w:ascii="Aptos" w:eastAsia="Aptos" w:hAnsi="Aptos" w:cs="Aptos"/>
+          <w:sz w:val="22"/>
+          <w:lang w:val="en-US"/>
+        </w:rPr>
+      </w:pPr>
+      <w:r>
+        <w:rPr>
+          <w:rFonts w:ascii="Aptos" w:eastAsia="Aptos" w:hAnsi="Aptos" w:cs="Aptos"/>
+          <w:sz w:val="22"/>
+          <w:lang w:val="en-US"/>
+        </w:rPr>
+        <w:t>Versión unity: 2022.3.25f1</w:t>
       </w:r>
     </w:p>
     <w:p>
@@ -81,25 +60,17 @@
           <w:rFonts w:ascii="Aptos Display" w:eastAsia="Aptos Display" w:hAnsi="Aptos Display" w:cs="Aptos Display"/>
           <w:color w:val="0F4761"/>
           <w:sz w:val="32"/>
-        </w:rPr>
-      </w:pPr>
-      <w:proofErr w:type="spellStart"/>
+          <w:lang w:val="en-US"/>
+        </w:rPr>
+      </w:pPr>
       <w:r>
         <w:rPr>
           <w:rFonts w:ascii="Aptos Display" w:eastAsia="Aptos Display" w:hAnsi="Aptos Display" w:cs="Aptos Display"/>
           <w:color w:val="0F4761"/>
           <w:sz w:val="32"/>
-        </w:rPr>
-        <w:t>Sprints</w:t>
-      </w:r>
-      <w:proofErr w:type="spellEnd"/>
-      <w:r>
-        <w:rPr>
-          <w:rFonts w:ascii="Aptos Display" w:eastAsia="Aptos Display" w:hAnsi="Aptos Display" w:cs="Aptos Display"/>
-          <w:color w:val="0F4761"/>
-          <w:sz w:val="32"/>
-        </w:rPr>
-        <w:t>:</w:t>
+          <w:lang w:val="en-US"/>
+        </w:rPr>
+        <w:t>Sprints:</w:t>
       </w:r>
     </w:p>
     <w:p>
@@ -144,55 +115,21 @@
           <w:sz w:val="22"/>
         </w:rPr>
         <w:tab/>
-        <w:t xml:space="preserve">Este primer sprint, además de ser más largo por ser el inicio del proyecto, plantea las nociones más básicas del videojuego. Las tareas realizadas en este sprint se corresponden con un aprendizaje del entorno de Unity, la creación de un escenario básico de pruebas utilizando </w:t>
-      </w:r>
-      <w:proofErr w:type="spellStart"/>
-      <w:r>
-        <w:rPr>
-          <w:rFonts w:ascii="Aptos" w:eastAsia="Aptos" w:hAnsi="Aptos" w:cs="Aptos"/>
-          <w:sz w:val="22"/>
-        </w:rPr>
-        <w:t>assets</w:t>
-      </w:r>
-      <w:proofErr w:type="spellEnd"/>
-      <w:r>
-        <w:rPr>
-          <w:rFonts w:ascii="Aptos" w:eastAsia="Aptos" w:hAnsi="Aptos" w:cs="Aptos"/>
-          <w:sz w:val="22"/>
-        </w:rPr>
-        <w:t xml:space="preserve"> gratuitos de Unity y el movimiento y animaciones del personaje principal. Estas animaciones se han creado utilizando </w:t>
-      </w:r>
-      <w:proofErr w:type="spellStart"/>
-      <w:r>
-        <w:rPr>
-          <w:rFonts w:ascii="Aptos" w:eastAsia="Aptos" w:hAnsi="Aptos" w:cs="Aptos"/>
-          <w:sz w:val="22"/>
-        </w:rPr>
-        <w:t>Aseprite</w:t>
-      </w:r>
-      <w:proofErr w:type="spellEnd"/>
-      <w:r>
-        <w:rPr>
-          <w:rFonts w:ascii="Aptos" w:eastAsia="Aptos" w:hAnsi="Aptos" w:cs="Aptos"/>
-          <w:sz w:val="22"/>
-        </w:rPr>
-        <w:t xml:space="preserve">, una aplicación centrada en el diseño de </w:t>
-      </w:r>
-      <w:proofErr w:type="spellStart"/>
-      <w:r>
-        <w:rPr>
-          <w:rFonts w:ascii="Aptos" w:eastAsia="Aptos" w:hAnsi="Aptos" w:cs="Aptos"/>
-          <w:sz w:val="22"/>
-        </w:rPr>
-        <w:t>sprites</w:t>
-      </w:r>
-      <w:proofErr w:type="spellEnd"/>
-      <w:r>
-        <w:rPr>
-          <w:rFonts w:ascii="Aptos" w:eastAsia="Aptos" w:hAnsi="Aptos" w:cs="Aptos"/>
-          <w:sz w:val="22"/>
-        </w:rPr>
-        <w:t>. Además de las acciones básicas como moverse a los lados y saltar, también se ha implementado el componente que llevará el ritmo en las escenas. Esto será posible al separar la música del juego en intervalos, haciendo que la música vaya ligada constantemente con el componente y no haya posibles retrasos o desajustes en las acciones realizadas al ritmo del juego.</w:t>
+        <w:t xml:space="preserve">Este primer sprint, además de ser más largo por ser el inicio del proyecto, plantea </w:t>
+      </w:r>
+      <w:r>
+        <w:rPr>
+          <w:rFonts w:ascii="Aptos" w:eastAsia="Aptos" w:hAnsi="Aptos" w:cs="Aptos"/>
+          <w:sz w:val="22"/>
+        </w:rPr>
+        <w:t xml:space="preserve">la elicitación de requisitos y </w:t>
+      </w:r>
+      <w:r>
+        <w:rPr>
+          <w:rFonts w:ascii="Aptos" w:eastAsia="Aptos" w:hAnsi="Aptos" w:cs="Aptos"/>
+          <w:sz w:val="22"/>
+        </w:rPr>
+        <w:t>las nociones más básicas del videojuego. Las tareas realizadas en este sprint se corresponden con un aprendizaje del entorno de Unity, la creación de un escenario básico de pruebas utilizando assets gratuitos de Unity y el movimiento y animaciones del personaje principal. Estas animaciones se han creado utilizando Aseprite, una aplicación centrada en el diseño de sprites. Además de las acciones básicas como moverse a los lados y saltar, también se ha implementado el componente que llevará el ritmo en las escenas. Esto será posible al separar la música del juego en intervalos, haciendo que la música vaya ligada constantemente con el componente y no haya posibles retrasos o desajustes en las acciones realizadas al ritmo del juego.</w:t>
       </w:r>
     </w:p>
     <w:p>
@@ -341,23 +278,7 @@
           <w:sz w:val="22"/>
         </w:rPr>
         <w:tab/>
-        <w:t xml:space="preserve">En este sprint se buscará implementar el sistema de vidas y mejorar la cámara. También paralelamente intentaré añadir animaciones que faltan del modo canción y </w:t>
-      </w:r>
-      <w:proofErr w:type="spellStart"/>
-      <w:r>
-        <w:rPr>
-          <w:rFonts w:ascii="Aptos" w:eastAsia="Aptos" w:hAnsi="Aptos" w:cs="Aptos"/>
-          <w:sz w:val="22"/>
-        </w:rPr>
-        <w:t>algun</w:t>
-      </w:r>
-      <w:proofErr w:type="spellEnd"/>
-      <w:r>
-        <w:rPr>
-          <w:rFonts w:ascii="Aptos" w:eastAsia="Aptos" w:hAnsi="Aptos" w:cs="Aptos"/>
-          <w:sz w:val="22"/>
-        </w:rPr>
-        <w:t xml:space="preserve"> efecto especial. </w:t>
+        <w:t xml:space="preserve">En este sprint se buscará implementar el sistema de vidas y mejorar la cámara. También paralelamente intentaré añadir animaciones que faltan del modo canción y algun efecto especial. </w:t>
       </w:r>
     </w:p>
     <w:p>
@@ -402,55 +323,7 @@
           <w:sz w:val="22"/>
         </w:rPr>
         <w:tab/>
-        <w:t xml:space="preserve">Quiero hacer en este sprint los </w:t>
-      </w:r>
-      <w:proofErr w:type="spellStart"/>
-      <w:r>
-        <w:rPr>
-          <w:rFonts w:ascii="Aptos" w:eastAsia="Aptos" w:hAnsi="Aptos" w:cs="Aptos"/>
-          <w:sz w:val="22"/>
-        </w:rPr>
-        <w:t>menus</w:t>
-      </w:r>
-      <w:proofErr w:type="spellEnd"/>
-      <w:r>
-        <w:rPr>
-          <w:rFonts w:ascii="Aptos" w:eastAsia="Aptos" w:hAnsi="Aptos" w:cs="Aptos"/>
-          <w:sz w:val="22"/>
-        </w:rPr>
-        <w:t xml:space="preserve"> y diseñar el primer nivel. Ahora que tengo los diferentes sonidos especiales de los movimientos tambien se implementarán en este sprint. Se terminará la tarea de mejorar la </w:t>
-      </w:r>
-      <w:proofErr w:type="spellStart"/>
-      <w:r>
-        <w:rPr>
-          <w:rFonts w:ascii="Aptos" w:eastAsia="Aptos" w:hAnsi="Aptos" w:cs="Aptos"/>
-          <w:sz w:val="22"/>
-        </w:rPr>
-        <w:t>camara</w:t>
-      </w:r>
-      <w:proofErr w:type="spellEnd"/>
-      <w:r>
-        <w:rPr>
-          <w:rFonts w:ascii="Aptos" w:eastAsia="Aptos" w:hAnsi="Aptos" w:cs="Aptos"/>
-          <w:sz w:val="22"/>
-        </w:rPr>
-        <w:t xml:space="preserve"> y poner las vidas, ya que ha sido pospuesta estos </w:t>
-      </w:r>
-      <w:proofErr w:type="spellStart"/>
-      <w:r>
-        <w:rPr>
-          <w:rFonts w:ascii="Aptos" w:eastAsia="Aptos" w:hAnsi="Aptos" w:cs="Aptos"/>
-          <w:sz w:val="22"/>
-        </w:rPr>
-        <w:t>sprints</w:t>
-      </w:r>
-      <w:proofErr w:type="spellEnd"/>
-      <w:r>
-        <w:rPr>
-          <w:rFonts w:ascii="Aptos" w:eastAsia="Aptos" w:hAnsi="Aptos" w:cs="Aptos"/>
-          <w:sz w:val="22"/>
-        </w:rPr>
-        <w:t>.</w:t>
+        <w:t>Quiero hacer en este sprint los menus y diseñar el primer nivel. Ahora que tengo los diferentes sonidos especiales de los movimientos tambien se implementarán en este sprint. Se terminará la tarea de mejorar la camara y poner las vidas, ya que ha sido pospuesta estos sprints.</w:t>
       </w:r>
       <w:r>
         <w:rPr>
@@ -475,39 +348,7 @@
           <w:sz w:val="22"/>
         </w:rPr>
         <w:tab/>
-        <w:t xml:space="preserve">Se le pasó un primer prototipo a </w:t>
-      </w:r>
-      <w:proofErr w:type="spellStart"/>
-      <w:r>
-        <w:rPr>
-          <w:rFonts w:ascii="Aptos" w:eastAsia="Aptos" w:hAnsi="Aptos" w:cs="Aptos"/>
-          <w:sz w:val="22"/>
-        </w:rPr>
-        <w:t>testers</w:t>
-      </w:r>
-      <w:proofErr w:type="spellEnd"/>
-      <w:r>
-        <w:rPr>
-          <w:rFonts w:ascii="Aptos" w:eastAsia="Aptos" w:hAnsi="Aptos" w:cs="Aptos"/>
-          <w:sz w:val="22"/>
-        </w:rPr>
-        <w:t xml:space="preserve"> de la aplicación para que me dieran </w:t>
-      </w:r>
-      <w:proofErr w:type="spellStart"/>
-      <w:r>
-        <w:rPr>
-          <w:rFonts w:ascii="Aptos" w:eastAsia="Aptos" w:hAnsi="Aptos" w:cs="Aptos"/>
-          <w:sz w:val="22"/>
-        </w:rPr>
-        <w:t>feedback</w:t>
-      </w:r>
-      <w:proofErr w:type="spellEnd"/>
-      <w:r>
-        <w:rPr>
-          <w:rFonts w:ascii="Aptos" w:eastAsia="Aptos" w:hAnsi="Aptos" w:cs="Aptos"/>
-          <w:sz w:val="22"/>
-        </w:rPr>
-        <w:t xml:space="preserve"> sobre las mecánicas del juego. En general se encontró dificultad para hacer uno de los ritmos, ya que no había una clave visual que ayudase a su ejecución. A raíz de eso se empezó una mejoría de la interfaz y se añadieron claves visuales que indican qué ritmo es necesario usar en cada situación.</w:t>
+        <w:t>Se le pasó un primer prototipo a testers de la aplicación para que me dieran feedback sobre las mecánicas del juego. En general se encontró dificultad para hacer uno de los ritmos, ya que no había una clave visual que ayudase a su ejecución. A raíz de eso se empezó una mejoría de la interfaz y se añadieron claves visuales que indican qué ritmo es necesario usar en cada situación.</w:t>
       </w:r>
     </w:p>
     <w:p>
@@ -534,6 +375,59 @@
         <w:rPr>
           <w:rFonts w:ascii="Aptos" w:eastAsia="Aptos" w:hAnsi="Aptos" w:cs="Aptos"/>
           <w:sz w:val="22"/>
+        </w:rPr>
+      </w:pPr>
+      <w:r>
+        <w:rPr>
+          <w:rFonts w:ascii="Aptos" w:eastAsia="Aptos" w:hAnsi="Aptos" w:cs="Aptos"/>
+          <w:sz w:val="22"/>
+        </w:rPr>
+        <w:tab/>
+        <w:t>Siendo este el ultimo sprint que queda, se terminará de implementar el nivel</w:t>
+      </w:r>
+      <w:r>
+        <w:rPr>
+          <w:rFonts w:ascii="Aptos" w:eastAsia="Aptos" w:hAnsi="Aptos" w:cs="Aptos"/>
+          <w:sz w:val="22"/>
+        </w:rPr>
+        <w:t xml:space="preserve"> que hará de tutorial y mostrará todas las mecánicas implementadas+</w:t>
+      </w:r>
+      <w:r>
+        <w:rPr>
+          <w:rFonts w:ascii="Aptos" w:eastAsia="Aptos" w:hAnsi="Aptos" w:cs="Aptos"/>
+          <w:sz w:val="22"/>
+        </w:rPr>
+        <w:t xml:space="preserve">. Esto conlleva, hacer dos enemigos, </w:t>
+      </w:r>
+      <w:r>
+        <w:rPr>
+          <w:rFonts w:ascii="Aptos" w:eastAsia="Aptos" w:hAnsi="Aptos" w:cs="Aptos"/>
+          <w:sz w:val="22"/>
+        </w:rPr>
+        <w:t xml:space="preserve">las barreras de sonido, </w:t>
+      </w:r>
+      <w:r>
+        <w:rPr>
+          <w:rFonts w:ascii="Aptos" w:eastAsia="Aptos" w:hAnsi="Aptos" w:cs="Aptos"/>
+          <w:sz w:val="22"/>
+        </w:rPr>
+        <w:t xml:space="preserve">el final del nivel y </w:t>
+      </w:r>
+      <w:r>
+        <w:rPr>
+          <w:rFonts w:ascii="Aptos" w:eastAsia="Aptos" w:hAnsi="Aptos" w:cs="Aptos"/>
+          <w:sz w:val="22"/>
+        </w:rPr>
+        <w:t>mejorar la calidad de juego general, esto conlleva arreglar bugs y demás.</w:t>
+      </w:r>
+    </w:p>
+    <w:p>
+      <w:pPr>
+        <w:spacing w:line="259" w:lineRule="auto"/>
+        <w:ind w:left="708" w:hanging="708"/>
+        <w:rPr>
+          <w:rFonts w:ascii="Aptos" w:eastAsia="Aptos" w:hAnsi="Aptos" w:cs="Aptos"/>
+          <w:sz w:val="22"/>
           <w:u w:val="single"/>
         </w:rPr>
       </w:pPr>
@@ -543,7 +437,13 @@
           <w:sz w:val="22"/>
         </w:rPr>
         <w:tab/>
-        <w:t xml:space="preserve">Siendo este el ultimo sprint que queda, se terminará de implementar el nivel. Esto conlleva, hacer dos enemigos, el final del nivel y </w:t>
+      </w:r>
+      <w:r>
+        <w:rPr>
+          <w:rFonts w:ascii="Aptos" w:eastAsia="Aptos" w:hAnsi="Aptos" w:cs="Aptos"/>
+          <w:sz w:val="22"/>
+        </w:rPr>
+        <w:t xml:space="preserve">Danger sign </w:t>
       </w:r>
     </w:p>
     <w:p>

</xml_diff>